<commit_message>
feat: stabilize pos-purchase flow and bilingual accounting labels
</commit_message>
<xml_diff>
--- a/docs/client-e2e-alignment-form.docx
+++ b/docs/client-e2e-alignment-form.docx
@@ -7,43 +7,40 @@
         <w:pStyle w:val="Heading1"/>
       </w:pPr>
       <w:r>
-        <w:t>Form Perencanaan End-to-End Implementasi</w:t>
+        <w:t>Form Isian Client - Perencanaan Implementasi End-to-End</w:t>
       </w:r>
     </w:p>
     <w:p/>
     <w:p>
       <w:r>
-        <w:t>Dokumen ini dipakai saat kick-off dengan client agar penyelarasan software cepat, terstruktur, dan minim revisi ulang.</w:t>
+        <w:t>Dokumen ini diisi langsung oleh pihak client.</w:t>
       </w:r>
     </w:p>
     <w:p/>
     <w:p>
       <w:r>
-        <w:t>Cara isi cepat:</w:t>
+        <w:t>Panduan singkat:</w:t>
       </w:r>
     </w:p>
     <w:p>
-      <w:pPr>
-        <w:pStyle w:val="ListBullet"/>
-      </w:pPr>
       <w:r>
-        <w:t>Pilih opsi pada setiap pertanyaan.</w:t>
+        <w:t>- Pilih salah satu opsi yang paling sesuai.</w:t>
       </w:r>
     </w:p>
     <w:p>
-      <w:pPr>
-        <w:pStyle w:val="ListBullet"/>
-      </w:pPr>
       <w:r>
-        <w:t>Isi kolom catatan hanya jika ada pengecualian.</w:t>
+        <w:t>- Jika perlu, tulis catatan singkat.</w:t>
       </w:r>
     </w:p>
     <w:p>
-      <w:pPr>
-        <w:pStyle w:val="ListBullet"/>
-      </w:pPr>
       <w:r>
-        <w:t>Tandai prioritas `MVP` atau `Phase 2`.</w:t>
+        <w:t>- Isi dengan kondisi operasional nyata saat ini.</w:t>
+      </w:r>
+    </w:p>
+    <w:p/>
+    <w:p>
+      <w:r>
+        <w:t>________________________________________________________________________________</w:t>
       </w:r>
     </w:p>
     <w:p/>
@@ -58,32 +55,91 @@
     <w:p/>
     <w:p>
       <w:r>
-        <w:t>| Pertanyaan | Opsi Cepat | Pilihan | Catatan Client |</w:t>
+        <w:t>1) Jenis bisnis utama</w:t>
       </w:r>
     </w:p>
     <w:p>
       <w:r>
-        <w:t>|---|---|---|---|</w:t>
+        <w:t>Pilihan: Restoran / Cafe / Retail / Jasa / Lainnya</w:t>
       </w:r>
     </w:p>
     <w:p>
       <w:r>
-        <w:t>| Jenis bisnis utama | Restoran / Cafe / Retail / Jasa / Lainnya |  |  |</w:t>
+        <w:t>Jawaban Client: ____________________</w:t>
       </w:r>
     </w:p>
     <w:p>
       <w:r>
-        <w:t>| Jumlah outlet saat ini | 1 / 2-5 / &gt;5 |  |  |</w:t>
+        <w:t>Catatan: ____________________</w:t>
+      </w:r>
+    </w:p>
+    <w:p/>
+    <w:p>
+      <w:r>
+        <w:t>2) Jumlah outlet aktif saat ini</w:t>
       </w:r>
     </w:p>
     <w:p>
       <w:r>
-        <w:t>| Metode operasional | Single gudang / Multi gudang / Per outlet stock |  |  |</w:t>
+        <w:t>Pilihan: 1 / 2-5 / &gt;5</w:t>
       </w:r>
     </w:p>
     <w:p>
       <w:r>
-        <w:t>| Target Go-Live | &lt;30 hari / 1-2 bulan / &gt;2 bulan |  |  |</w:t>
+        <w:t>Jawaban Client: ____________________</w:t>
+      </w:r>
+    </w:p>
+    <w:p>
+      <w:r>
+        <w:t>Catatan: ____________________</w:t>
+      </w:r>
+    </w:p>
+    <w:p/>
+    <w:p>
+      <w:r>
+        <w:t>3) Model operasional stok saat ini</w:t>
+      </w:r>
+    </w:p>
+    <w:p>
+      <w:r>
+        <w:t>Pilihan: Satu gudang pusat / Gudang per outlet / Campuran</w:t>
+      </w:r>
+    </w:p>
+    <w:p>
+      <w:r>
+        <w:t>Jawaban Client: ____________________</w:t>
+      </w:r>
+    </w:p>
+    <w:p>
+      <w:r>
+        <w:t>Catatan: ____________________</w:t>
+      </w:r>
+    </w:p>
+    <w:p/>
+    <w:p>
+      <w:r>
+        <w:t>4) Target mulai pakai sistem (go-live)</w:t>
+      </w:r>
+    </w:p>
+    <w:p>
+      <w:r>
+        <w:t>Pilihan: &lt;30 hari / 1-2 bulan / &gt;2 bulan</w:t>
+      </w:r>
+    </w:p>
+    <w:p>
+      <w:r>
+        <w:t>Jawaban Client: ____________________</w:t>
+      </w:r>
+    </w:p>
+    <w:p>
+      <w:r>
+        <w:t>Catatan: ____________________</w:t>
+      </w:r>
+    </w:p>
+    <w:p/>
+    <w:p>
+      <w:r>
+        <w:t>________________________________________________________________________________</w:t>
       </w:r>
     </w:p>
     <w:p/>
@@ -92,53 +148,139 @@
         <w:pStyle w:val="Heading2"/>
       </w:pPr>
       <w:r>
-        <w:t>B. Master Data dan Persediaan Barang Dagang</w:t>
+        <w:t>B. Data Barang dan Stok</w:t>
       </w:r>
     </w:p>
     <w:p/>
     <w:p>
       <w:r>
-        <w:t>| Pertanyaan | Opsi Cepat | Pilihan | Catatan Client |</w:t>
+        <w:t>1) Data barang yang dipakai harian</w:t>
       </w:r>
     </w:p>
     <w:p>
       <w:r>
-        <w:t>|---|---|---|---|</w:t>
+        <w:t>Pilihan: Menu jadi / Bahan baku / Keduanya</w:t>
       </w:r>
     </w:p>
     <w:p>
       <w:r>
-        <w:t>| Data barang yang dipakai harian | Hanya menu jadi / Hanya bahan baku / Keduanya |  |  |</w:t>
+        <w:t>Jawaban Client: ____________________</w:t>
       </w:r>
     </w:p>
     <w:p>
       <w:r>
-        <w:t>| Cara hitung satuan barang | Satuan sederhana (pcs, porsi) / Campuran (kg-gram, liter-ml) |  |  |</w:t>
+        <w:t>Catatan: ____________________</w:t>
+      </w:r>
+    </w:p>
+    <w:p/>
+    <w:p>
+      <w:r>
+        <w:t>2) Cara satuan barang</w:t>
       </w:r>
     </w:p>
     <w:p>
       <w:r>
-        <w:t>| Jika stok habis saat jual | Harus ditolak / Boleh lanjut dengan peringatan |  |  |</w:t>
+        <w:t>Pilihan: Sederhana (pcs/porsi) / Campuran (kg-gram, liter-ml)</w:t>
       </w:r>
     </w:p>
     <w:p>
       <w:r>
-        <w:t>| Titik stok minimum | Tidak pakai batas minimum / Pakai batas minimum per barang |  |  |</w:t>
+        <w:t>Jawaban Client: ____________________</w:t>
       </w:r>
     </w:p>
     <w:p>
       <w:r>
-        <w:t>| Harga jual | Satu harga / Beda harga per channel (dine-in, takeaway, online) |  |  |</w:t>
+        <w:t>Catatan: ____________________</w:t>
+      </w:r>
+    </w:p>
+    <w:p/>
+    <w:p>
+      <w:r>
+        <w:t>3) Jika stok habis saat transaksi</w:t>
       </w:r>
     </w:p>
     <w:p>
       <w:r>
-        <w:t>| Barang yang sering kosong | Jarang / Kadang / Sering |  |  |</w:t>
+        <w:t>Pilihan: Harus ditolak / Boleh lanjut dengan peringatan</w:t>
       </w:r>
     </w:p>
     <w:p>
       <w:r>
-        <w:t>| Frekuensi stock opname | Harian / Mingguan / Bulanan / Tidak terjadwal |  |  |</w:t>
+        <w:t>Jawaban Client: ____________________</w:t>
+      </w:r>
+    </w:p>
+    <w:p>
+      <w:r>
+        <w:t>Catatan: ____________________</w:t>
+      </w:r>
+    </w:p>
+    <w:p/>
+    <w:p>
+      <w:r>
+        <w:t>4) Batas stok minimum</w:t>
+      </w:r>
+    </w:p>
+    <w:p>
+      <w:r>
+        <w:t>Pilihan: Tidak pakai / Pakai per barang</w:t>
+      </w:r>
+    </w:p>
+    <w:p>
+      <w:r>
+        <w:t>Jawaban Client: ____________________</w:t>
+      </w:r>
+    </w:p>
+    <w:p>
+      <w:r>
+        <w:t>Catatan: ____________________</w:t>
+      </w:r>
+    </w:p>
+    <w:p/>
+    <w:p>
+      <w:r>
+        <w:t>5) Harga jual</w:t>
+      </w:r>
+    </w:p>
+    <w:p>
+      <w:r>
+        <w:t>Pilihan: Satu harga / Beda harga per channel</w:t>
+      </w:r>
+    </w:p>
+    <w:p>
+      <w:r>
+        <w:t>Jawaban Client: ____________________</w:t>
+      </w:r>
+    </w:p>
+    <w:p>
+      <w:r>
+        <w:t>Catatan: ____________________</w:t>
+      </w:r>
+    </w:p>
+    <w:p/>
+    <w:p>
+      <w:r>
+        <w:t>6) Frekuensi stock opname</w:t>
+      </w:r>
+    </w:p>
+    <w:p>
+      <w:r>
+        <w:t>Pilihan: Harian / Mingguan / Bulanan / Tidak terjadwal</w:t>
+      </w:r>
+    </w:p>
+    <w:p>
+      <w:r>
+        <w:t>Jawaban Client: ____________________</w:t>
+      </w:r>
+    </w:p>
+    <w:p>
+      <w:r>
+        <w:t>Catatan: ____________________</w:t>
+      </w:r>
+    </w:p>
+    <w:p/>
+    <w:p>
+      <w:r>
+        <w:t>________________________________________________________________________________</w:t>
       </w:r>
     </w:p>
     <w:p/>
@@ -147,58 +289,181 @@
         <w:pStyle w:val="Heading2"/>
       </w:pPr>
       <w:r>
-        <w:t>C. Behavior POS (Penjualan)</w:t>
+        <w:t>C. Operasional POS</w:t>
       </w:r>
     </w:p>
     <w:p/>
     <w:p>
       <w:r>
-        <w:t>| Pertanyaan | Opsi Cepat | Pilihan | Catatan Client |</w:t>
+        <w:t>1) Jenis layanan utama</w:t>
       </w:r>
     </w:p>
     <w:p>
       <w:r>
-        <w:t>|---|---|---|---|</w:t>
+        <w:t>Pilihan: Dine-in / Takeaway / Delivery / Campuran</w:t>
       </w:r>
     </w:p>
     <w:p>
       <w:r>
-        <w:t>| Jenis layanan utama | Dine-in / Takeaway / Delivery / Campuran |  |  |</w:t>
+        <w:t>Jawaban Client: ____________________</w:t>
       </w:r>
     </w:p>
     <w:p>
       <w:r>
-        <w:t>| Pemesanan berdasarkan | Tanpa meja / Meja restoran / Kamar-lokasi / Campuran |  |  |</w:t>
+        <w:t>Catatan: ____________________</w:t>
+      </w:r>
+    </w:p>
+    <w:p/>
+    <w:p>
+      <w:r>
+        <w:t>2) Pemesanan berdasarkan</w:t>
       </w:r>
     </w:p>
     <w:p>
       <w:r>
-        <w:t>| Proses meja/lokasi | Tidak perlu buka-tutup / Perlu status buka-tutup meja |  |  |</w:t>
+        <w:t>Pilihan: Tanpa meja / Meja restoran / Kamar-lokasi / Campuran</w:t>
       </w:r>
     </w:p>
     <w:p>
       <w:r>
-        <w:t>| Metode pembayaran yang dipakai | Cash / Transfer / QRIS / E-wallet / Kartu / Campuran |  |  |</w:t>
+        <w:t>Jawaban Client: ____________________</w:t>
       </w:r>
     </w:p>
     <w:p>
       <w:r>
-        <w:t>| Pembayaran gabungan (split bill) | Tidak perlu / Kadang perlu / Sering perlu |  |  |</w:t>
+        <w:t>Catatan: ____________________</w:t>
+      </w:r>
+    </w:p>
+    <w:p/>
+    <w:p>
+      <w:r>
+        <w:t>3) Status meja/lokasi</w:t>
       </w:r>
     </w:p>
     <w:p>
       <w:r>
-        <w:t>| Menahan pesanan sementara (hold) | Tidak perlu / Perlu |  |  |</w:t>
+        <w:t>Pilihan: Tidak perlu buka-tutup / Perlu status buka-tutup</w:t>
       </w:r>
     </w:p>
     <w:p>
       <w:r>
-        <w:t>| Pembatalan item/transaksi | Bebas kasir / Harus supervisor / Harus manager |  |  |</w:t>
+        <w:t>Jawaban Client: ____________________</w:t>
       </w:r>
     </w:p>
     <w:p>
       <w:r>
-        <w:t>| Kecepatan update stok setelah transaksi | Langsung saat transaksi / Boleh di akhir shift |  |  |</w:t>
+        <w:t>Catatan: ____________________</w:t>
+      </w:r>
+    </w:p>
+    <w:p/>
+    <w:p>
+      <w:r>
+        <w:t>4) Metode pembayaran yang dipakai</w:t>
+      </w:r>
+    </w:p>
+    <w:p>
+      <w:r>
+        <w:t>Pilihan: Cash / Transfer / QRIS / E-wallet / Kartu / Campuran</w:t>
+      </w:r>
+    </w:p>
+    <w:p>
+      <w:r>
+        <w:t>Jawaban Client: ____________________</w:t>
+      </w:r>
+    </w:p>
+    <w:p>
+      <w:r>
+        <w:t>Catatan: ____________________</w:t>
+      </w:r>
+    </w:p>
+    <w:p/>
+    <w:p>
+      <w:r>
+        <w:t>5) Split bill</w:t>
+      </w:r>
+    </w:p>
+    <w:p>
+      <w:r>
+        <w:t>Pilihan: Tidak perlu / Kadang perlu / Sering perlu</w:t>
+      </w:r>
+    </w:p>
+    <w:p>
+      <w:r>
+        <w:t>Jawaban Client: ____________________</w:t>
+      </w:r>
+    </w:p>
+    <w:p>
+      <w:r>
+        <w:t>Catatan: ____________________</w:t>
+      </w:r>
+    </w:p>
+    <w:p/>
+    <w:p>
+      <w:r>
+        <w:t>6) Hold order (tahan pesanan sementara)</w:t>
+      </w:r>
+    </w:p>
+    <w:p>
+      <w:r>
+        <w:t>Pilihan: Tidak perlu / Perlu</w:t>
+      </w:r>
+    </w:p>
+    <w:p>
+      <w:r>
+        <w:t>Jawaban Client: ____________________</w:t>
+      </w:r>
+    </w:p>
+    <w:p>
+      <w:r>
+        <w:t>Catatan: ____________________</w:t>
+      </w:r>
+    </w:p>
+    <w:p/>
+    <w:p>
+      <w:r>
+        <w:t>7) Siapa boleh batalkan item/transaksi</w:t>
+      </w:r>
+    </w:p>
+    <w:p>
+      <w:r>
+        <w:t>Pilihan: Kasir / Supervisor / Manager</w:t>
+      </w:r>
+    </w:p>
+    <w:p>
+      <w:r>
+        <w:t>Jawaban Client: ____________________</w:t>
+      </w:r>
+    </w:p>
+    <w:p>
+      <w:r>
+        <w:t>Catatan: ____________________</w:t>
+      </w:r>
+    </w:p>
+    <w:p/>
+    <w:p>
+      <w:r>
+        <w:t>8) Update stok setelah transaksi</w:t>
+      </w:r>
+    </w:p>
+    <w:p>
+      <w:r>
+        <w:t>Pilihan: Langsung saat transaksi / Boleh di akhir shift</w:t>
+      </w:r>
+    </w:p>
+    <w:p>
+      <w:r>
+        <w:t>Jawaban Client: ____________________</w:t>
+      </w:r>
+    </w:p>
+    <w:p>
+      <w:r>
+        <w:t>Catatan: ____________________</w:t>
+      </w:r>
+    </w:p>
+    <w:p/>
+    <w:p>
+      <w:r>
+        <w:t>________________________________________________________________________________</w:t>
       </w:r>
     </w:p>
     <w:p/>
@@ -207,48 +472,118 @@
         <w:pStyle w:val="Heading2"/>
       </w:pPr>
       <w:r>
-        <w:t>D. Pencatatan Dapur dan Produksi</w:t>
+        <w:t>D. Operasional Dapur</w:t>
       </w:r>
     </w:p>
     <w:p/>
     <w:p>
       <w:r>
-        <w:t>| Pertanyaan | Opsi Cepat | Pilihan | Catatan Client |</w:t>
+        <w:t>1) Pengurangan bahan saat menu terjual</w:t>
       </w:r>
     </w:p>
     <w:p>
       <w:r>
-        <w:t>|---|---|---|---|</w:t>
+        <w:t>Pilihan: Otomatis / Manual / Campuran</w:t>
       </w:r>
     </w:p>
     <w:p>
       <w:r>
-        <w:t>| Pengurangan bahan saat menu terjual | Otomatis / Manual / Campuran |  |  |</w:t>
+        <w:t>Jawaban Client: ____________________</w:t>
       </w:r>
     </w:p>
     <w:p>
       <w:r>
-        <w:t>| Kebutuhan resep standar per menu | Tidak perlu / Per menu utama / Semua menu |  |  |</w:t>
+        <w:t>Catatan: ____________________</w:t>
+      </w:r>
+    </w:p>
+    <w:p/>
+    <w:p>
+      <w:r>
+        <w:t>2) Kebutuhan resep standar per menu</w:t>
       </w:r>
     </w:p>
     <w:p>
       <w:r>
-        <w:t>| Pencatatan bahan terbuang/rusak | Tidak dicatat / Dicatat per shift / Dicatat per item |  |  |</w:t>
+        <w:t>Pilihan: Tidak perlu / Menu utama saja / Semua menu</w:t>
       </w:r>
     </w:p>
     <w:p>
       <w:r>
-        <w:t>| Persiapan batch (prep) harian | Tidak ada / Ada untuk item tertentu / Ada untuk banyak item |  |  |</w:t>
+        <w:t>Jawaban Client: ____________________</w:t>
       </w:r>
     </w:p>
     <w:p>
       <w:r>
-        <w:t>| Perubahan resep/harga pokok | Siapa saja / Head Chef / Owner |  |  |</w:t>
+        <w:t>Catatan: ____________________</w:t>
+      </w:r>
+    </w:p>
+    <w:p/>
+    <w:p>
+      <w:r>
+        <w:t>3) Pencatatan bahan rusak/terbuang</w:t>
       </w:r>
     </w:p>
     <w:p>
       <w:r>
-        <w:t>| Estimasi kebutuhan dapur | Manual / Ingin dibantu sistem |  |  |</w:t>
+        <w:t>Pilihan: Tidak dicatat / Per shift / Per item</w:t>
+      </w:r>
+    </w:p>
+    <w:p>
+      <w:r>
+        <w:t>Jawaban Client: ____________________</w:t>
+      </w:r>
+    </w:p>
+    <w:p>
+      <w:r>
+        <w:t>Catatan: ____________________</w:t>
+      </w:r>
+    </w:p>
+    <w:p/>
+    <w:p>
+      <w:r>
+        <w:t>4) Persiapan batch (prep)</w:t>
+      </w:r>
+    </w:p>
+    <w:p>
+      <w:r>
+        <w:t>Pilihan: Tidak ada / Ada untuk item tertentu / Ada untuk banyak item</w:t>
+      </w:r>
+    </w:p>
+    <w:p>
+      <w:r>
+        <w:t>Jawaban Client: ____________________</w:t>
+      </w:r>
+    </w:p>
+    <w:p>
+      <w:r>
+        <w:t>Catatan: ____________________</w:t>
+      </w:r>
+    </w:p>
+    <w:p/>
+    <w:p>
+      <w:r>
+        <w:t>5) Siapa boleh ubah resep/harga pokok</w:t>
+      </w:r>
+    </w:p>
+    <w:p>
+      <w:r>
+        <w:t>Pilihan: Staff dapur / Head Chef / Owner</w:t>
+      </w:r>
+    </w:p>
+    <w:p>
+      <w:r>
+        <w:t>Jawaban Client: ____________________</w:t>
+      </w:r>
+    </w:p>
+    <w:p>
+      <w:r>
+        <w:t>Catatan: ____________________</w:t>
+      </w:r>
+    </w:p>
+    <w:p/>
+    <w:p>
+      <w:r>
+        <w:t>________________________________________________________________________________</w:t>
       </w:r>
     </w:p>
     <w:p/>
@@ -257,48 +592,118 @@
         <w:pStyle w:val="Heading2"/>
       </w:pPr>
       <w:r>
-        <w:t>E. Pembelian dan Penerimaan</w:t>
+        <w:t>E. Pembelian dan Supplier</w:t>
       </w:r>
     </w:p>
     <w:p/>
     <w:p>
       <w:r>
-        <w:t>| Pertanyaan | Opsi Cepat | Pilihan | Catatan Client |</w:t>
+        <w:t>1) Cara belanja paling sering</w:t>
       </w:r>
     </w:p>
     <w:p>
       <w:r>
-        <w:t>|---|---|---|---|</w:t>
+        <w:t>Pilihan: Belanja cepat harian / PO formal / Campuran</w:t>
       </w:r>
     </w:p>
     <w:p>
       <w:r>
-        <w:t>| Cara belanja paling sering | Belanja cepat harian / PO formal / Campuran |  |  |</w:t>
+        <w:t>Jawaban Client: ____________________</w:t>
       </w:r>
     </w:p>
     <w:p>
       <w:r>
-        <w:t>| Pola pembayaran supplier | Tunai langsung / Tempo bulanan / Campuran |  |  |</w:t>
+        <w:t>Catatan: ____________________</w:t>
+      </w:r>
+    </w:p>
+    <w:p/>
+    <w:p>
+      <w:r>
+        <w:t>2) Pola pembayaran supplier</w:t>
       </w:r>
     </w:p>
     <w:p>
       <w:r>
-        <w:t>| Barang datang tidak sesuai | Langsung ditolak / Tetap diterima sebagian / Tergantung supplier |  |  |</w:t>
+        <w:t>Pilihan: Tunai langsung / Tempo bulanan / Campuran</w:t>
       </w:r>
     </w:p>
     <w:p>
       <w:r>
-        <w:t>| Retur ke supplier | Jarang / Kadang / Sering |  |  |</w:t>
+        <w:t>Jawaban Client: ____________________</w:t>
       </w:r>
     </w:p>
     <w:p>
       <w:r>
-        <w:t>| Approval pembelian | Tidak perlu / Perlu untuk nominal tertentu / Selalu perlu |  |  |</w:t>
+        <w:t>Catatan: ____________________</w:t>
+      </w:r>
+    </w:p>
+    <w:p/>
+    <w:p>
+      <w:r>
+        <w:t>3) Jika barang datang tidak sesuai</w:t>
       </w:r>
     </w:p>
     <w:p>
       <w:r>
-        <w:t>| Bukti pembelian | Kertas / Digital / Campuran |  |  |</w:t>
+        <w:t>Pilihan: Ditolak / Diterima sebagian / Tergantung kondisi</w:t>
+      </w:r>
+    </w:p>
+    <w:p>
+      <w:r>
+        <w:t>Jawaban Client: ____________________</w:t>
+      </w:r>
+    </w:p>
+    <w:p>
+      <w:r>
+        <w:t>Catatan: ____________________</w:t>
+      </w:r>
+    </w:p>
+    <w:p/>
+    <w:p>
+      <w:r>
+        <w:t>4) Retur pembelian ke supplier</w:t>
+      </w:r>
+    </w:p>
+    <w:p>
+      <w:r>
+        <w:t>Pilihan: Jarang / Kadang / Sering</w:t>
+      </w:r>
+    </w:p>
+    <w:p>
+      <w:r>
+        <w:t>Jawaban Client: ____________________</w:t>
+      </w:r>
+    </w:p>
+    <w:p>
+      <w:r>
+        <w:t>Catatan: ____________________</w:t>
+      </w:r>
+    </w:p>
+    <w:p/>
+    <w:p>
+      <w:r>
+        <w:t>5) Persetujuan pembelian</w:t>
+      </w:r>
+    </w:p>
+    <w:p>
+      <w:r>
+        <w:t>Pilihan: Tidak perlu / Per nominal tertentu / Selalu perlu</w:t>
+      </w:r>
+    </w:p>
+    <w:p>
+      <w:r>
+        <w:t>Jawaban Client: ____________________</w:t>
+      </w:r>
+    </w:p>
+    <w:p>
+      <w:r>
+        <w:t>Catatan: ____________________</w:t>
+      </w:r>
+    </w:p>
+    <w:p/>
+    <w:p>
+      <w:r>
+        <w:t>________________________________________________________________________________</w:t>
       </w:r>
     </w:p>
     <w:p/>
@@ -307,48 +712,118 @@
         <w:pStyle w:val="Heading2"/>
       </w:pPr>
       <w:r>
-        <w:t>F. Akuntansi dan Jurnal</w:t>
+        <w:t>F. Keuangan dan Laporan</w:t>
       </w:r>
     </w:p>
     <w:p/>
     <w:p>
       <w:r>
-        <w:t>| Pertanyaan | Opsi Cepat | Pilihan | Catatan Client |</w:t>
+        <w:t>1) Pencatatan transaksi ke laporan keuangan</w:t>
       </w:r>
     </w:p>
     <w:p>
       <w:r>
-        <w:t>|---|---|---|---|</w:t>
+        <w:t>Pilihan: Otomatis langsung / Dicek dulu / Rekap akhir hari</w:t>
       </w:r>
     </w:p>
     <w:p>
       <w:r>
-        <w:t>| Pencatatan transaksi ke laporan keuangan | Otomatis langsung / Dicek dulu lalu disahkan / Rekap akhir hari |  |  |</w:t>
+        <w:t>Jawaban Client: ____________________</w:t>
       </w:r>
     </w:p>
     <w:p>
       <w:r>
-        <w:t>| Detail laporan biaya yang diinginkan | Ringkas / Menengah / Sangat detail (per menu/per shift) |  |  |</w:t>
+        <w:t>Catatan: ____________________</w:t>
+      </w:r>
+    </w:p>
+    <w:p/>
+    <w:p>
+      <w:r>
+        <w:t>2) Detail laporan biaya yang diinginkan</w:t>
       </w:r>
     </w:p>
     <w:p>
       <w:r>
-        <w:t>| Pengaturan pajak | Tidak pakai pajak / Pajak standar / Pajak khusus |  |  |</w:t>
+        <w:t>Pilihan: Ringkas / Menengah / Detail</w:t>
       </w:r>
     </w:p>
     <w:p>
       <w:r>
-        <w:t>| Penutupan laporan | Harian / Mingguan / Bulanan |  |  |</w:t>
+        <w:t>Jawaban Client: ____________________</w:t>
       </w:r>
     </w:p>
     <w:p>
       <w:r>
-        <w:t>| Struktur akun | Pakai default sistem / Disesuaikan dengan bisnis |  |  |</w:t>
+        <w:t>Catatan: ____________________</w:t>
+      </w:r>
+    </w:p>
+    <w:p/>
+    <w:p>
+      <w:r>
+        <w:t>3) Pajak transaksi</w:t>
       </w:r>
     </w:p>
     <w:p>
       <w:r>
-        <w:t>| Siapa yang review laporan | Owner / Admin keuangan / Manager outlet |  |  |</w:t>
+        <w:t>Pilihan: Tidak pakai / Pajak standar / Pajak khusus</w:t>
+      </w:r>
+    </w:p>
+    <w:p>
+      <w:r>
+        <w:t>Jawaban Client: ____________________</w:t>
+      </w:r>
+    </w:p>
+    <w:p>
+      <w:r>
+        <w:t>Catatan: ____________________</w:t>
+      </w:r>
+    </w:p>
+    <w:p/>
+    <w:p>
+      <w:r>
+        <w:t>4) Periode tutup laporan</w:t>
+      </w:r>
+    </w:p>
+    <w:p>
+      <w:r>
+        <w:t>Pilihan: Harian / Mingguan / Bulanan</w:t>
+      </w:r>
+    </w:p>
+    <w:p>
+      <w:r>
+        <w:t>Jawaban Client: ____________________</w:t>
+      </w:r>
+    </w:p>
+    <w:p>
+      <w:r>
+        <w:t>Catatan: ____________________</w:t>
+      </w:r>
+    </w:p>
+    <w:p/>
+    <w:p>
+      <w:r>
+        <w:t>5) Struktur akun</w:t>
+      </w:r>
+    </w:p>
+    <w:p>
+      <w:r>
+        <w:t>Pilihan: Pakai default sistem / Disesuaikan bisnis</w:t>
+      </w:r>
+    </w:p>
+    <w:p>
+      <w:r>
+        <w:t>Jawaban Client: ____________________</w:t>
+      </w:r>
+    </w:p>
+    <w:p>
+      <w:r>
+        <w:t>Catatan: ____________________</w:t>
+      </w:r>
+    </w:p>
+    <w:p/>
+    <w:p>
+      <w:r>
+        <w:t>________________________________________________________________________________</w:t>
       </w:r>
     </w:p>
     <w:p/>
@@ -357,43 +832,97 @@
         <w:pStyle w:val="Heading2"/>
       </w:pPr>
       <w:r>
-        <w:t>G. Kontrol, Approval, dan Akses</w:t>
+        <w:t>G. Approval dan Hak Akses</w:t>
       </w:r>
     </w:p>
     <w:p/>
     <w:p>
       <w:r>
-        <w:t>| Pertanyaan | Opsi Cepat | Pilihan | Catatan Client |</w:t>
+        <w:t>1) Level approval</w:t>
       </w:r>
     </w:p>
     <w:p>
       <w:r>
-        <w:t>|---|---|---|---|</w:t>
+        <w:t>Pilihan: Tidak perlu / 1 level / 2 level atau lebih</w:t>
       </w:r>
     </w:p>
     <w:p>
       <w:r>
-        <w:t>| Level persetujuan | Tidak perlu approval / 1 level / 2 level atau lebih |  |  |</w:t>
+        <w:t>Jawaban Client: ____________________</w:t>
       </w:r>
     </w:p>
     <w:p>
       <w:r>
-        <w:t>| Pengaturan hak akses user | Standar / Per jabatan detail / Per orang |  |  |</w:t>
+        <w:t>Catatan: ____________________</w:t>
+      </w:r>
+    </w:p>
+    <w:p/>
+    <w:p>
+      <w:r>
+        <w:t>2) Pengaturan hak akses user</w:t>
       </w:r>
     </w:p>
     <w:p>
       <w:r>
-        <w:t>| Batas diskon di kasir | Tidak dibatasi / Dibatasi per kasir / Dibatasi per jabatan |  |  |</w:t>
+        <w:t>Pilihan: Standar / Per jabatan detail / Per orang</w:t>
       </w:r>
     </w:p>
     <w:p>
       <w:r>
-        <w:t>| Riwayat perubahan data | Dasar / Lengkap per perubahan |  |  |</w:t>
+        <w:t>Jawaban Client: ____________________</w:t>
       </w:r>
     </w:p>
     <w:p>
       <w:r>
-        <w:t>| Kebutuhan PIN supervisor di kasir | Tidak perlu / Per aksi tertentu / Wajib |  |  |</w:t>
+        <w:t>Catatan: ____________________</w:t>
+      </w:r>
+    </w:p>
+    <w:p/>
+    <w:p>
+      <w:r>
+        <w:t>3) Batas diskon di kasir</w:t>
+      </w:r>
+    </w:p>
+    <w:p>
+      <w:r>
+        <w:t>Pilihan: Tidak dibatasi / Per kasir / Per jabatan</w:t>
+      </w:r>
+    </w:p>
+    <w:p>
+      <w:r>
+        <w:t>Jawaban Client: ____________________</w:t>
+      </w:r>
+    </w:p>
+    <w:p>
+      <w:r>
+        <w:t>Catatan: ____________________</w:t>
+      </w:r>
+    </w:p>
+    <w:p/>
+    <w:p>
+      <w:r>
+        <w:t>4) Riwayat perubahan data</w:t>
+      </w:r>
+    </w:p>
+    <w:p>
+      <w:r>
+        <w:t>Pilihan: Dasar / Lengkap</w:t>
+      </w:r>
+    </w:p>
+    <w:p>
+      <w:r>
+        <w:t>Jawaban Client: ____________________</w:t>
+      </w:r>
+    </w:p>
+    <w:p>
+      <w:r>
+        <w:t>Catatan: ____________________</w:t>
+      </w:r>
+    </w:p>
+    <w:p/>
+    <w:p>
+      <w:r>
+        <w:t>________________________________________________________________________________</w:t>
       </w:r>
     </w:p>
     <w:p/>
@@ -402,43 +931,97 @@
         <w:pStyle w:val="Heading2"/>
       </w:pPr>
       <w:r>
-        <w:t>H. Laporan dan KPI</w:t>
+        <w:t>H. Migrasi Data dan Integrasi</w:t>
       </w:r>
     </w:p>
     <w:p/>
     <w:p>
       <w:r>
-        <w:t>| Pertanyaan | Opsi Cepat | Pilihan | Catatan Client |</w:t>
+        <w:t>1) Data lama berasal dari</w:t>
       </w:r>
     </w:p>
     <w:p>
       <w:r>
-        <w:t>|---|---|---|---|</w:t>
+        <w:t>Pilihan: Excel / POS lama / Sistem lain / Tidak ada</w:t>
       </w:r>
     </w:p>
     <w:p>
       <w:r>
-        <w:t>| Laporan paling penting | Penjualan / Laba kotor / Biaya bahan / Waste / Arus kas |  |  |</w:t>
+        <w:t>Jawaban Client: ____________________</w:t>
       </w:r>
     </w:p>
     <w:p>
       <w:r>
-        <w:t>| Kapan laporan dibutuhkan | Real-time / Akhir shift / Harian / Mingguan / Bulanan |  |  |</w:t>
+        <w:t>Catatan: ____________________</w:t>
+      </w:r>
+    </w:p>
+    <w:p/>
+    <w:p>
+      <w:r>
+        <w:t>2) Data yang mau dipindahkan di awal</w:t>
       </w:r>
     </w:p>
     <w:p>
       <w:r>
-        <w:t>| Format laporan yang disukai | Di layar saja / PDF / Excel / Keduanya |  |  |</w:t>
+        <w:t>Pilihan: Master saja / Master + saldo awal / Full histori</w:t>
       </w:r>
     </w:p>
     <w:p>
       <w:r>
-        <w:t>| Tingkat detail dashboard | Ringkas untuk owner / Detail untuk operasional |  |  |</w:t>
+        <w:t>Jawaban Client: ____________________</w:t>
       </w:r>
     </w:p>
     <w:p>
       <w:r>
-        <w:t>| Laporan per outlet | Tidak perlu / Perlu |  |  |</w:t>
+        <w:t>Catatan: ____________________</w:t>
+      </w:r>
+    </w:p>
+    <w:p/>
+    <w:p>
+      <w:r>
+        <w:t>3) Integrasi yang dibutuhkan</w:t>
+      </w:r>
+    </w:p>
+    <w:p>
+      <w:r>
+        <w:t>Pilihan: Tidak ada / Payment / Marketplace / Delivery app / Lainnya</w:t>
+      </w:r>
+    </w:p>
+    <w:p>
+      <w:r>
+        <w:t>Jawaban Client: ____________________</w:t>
+      </w:r>
+    </w:p>
+    <w:p>
+      <w:r>
+        <w:t>Catatan: ____________________</w:t>
+      </w:r>
+    </w:p>
+    <w:p/>
+    <w:p>
+      <w:r>
+        <w:t>4) Kebutuhan pertukaran data antar sistem</w:t>
+      </w:r>
+    </w:p>
+    <w:p>
+      <w:r>
+        <w:t>Pilihan: Tidak perlu / Lihat data saja / Kirim dan terima data</w:t>
+      </w:r>
+    </w:p>
+    <w:p>
+      <w:r>
+        <w:t>Jawaban Client: ____________________</w:t>
+      </w:r>
+    </w:p>
+    <w:p>
+      <w:r>
+        <w:t>Catatan: ____________________</w:t>
+      </w:r>
+    </w:p>
+    <w:p/>
+    <w:p>
+      <w:r>
+        <w:t>________________________________________________________________________________</w:t>
       </w:r>
     </w:p>
     <w:p/>
@@ -447,43 +1030,145 @@
         <w:pStyle w:val="Heading2"/>
       </w:pPr>
       <w:r>
-        <w:t>I. Migrasi Data dan Integrasi</w:t>
+        <w:t>I. Prioritas Implementasi</w:t>
       </w:r>
     </w:p>
     <w:p/>
     <w:p>
       <w:r>
-        <w:t>| Pertanyaan | Opsi Cepat | Pilihan | Catatan Client |</w:t>
+        <w:t>Isi prioritas tiap area:</w:t>
+      </w:r>
+    </w:p>
+    <w:p/>
+    <w:p>
+      <w:r>
+        <w:t>1) POS + Pembayaran</w:t>
       </w:r>
     </w:p>
     <w:p>
       <w:r>
-        <w:t>|---|---|---|---|</w:t>
+        <w:t>Pilihan: MVP / Phase 2 / Phase 3</w:t>
       </w:r>
     </w:p>
     <w:p>
       <w:r>
-        <w:t>| Data lama berasal dari | Excel / Aplikasi POS lama / Sistem lain / Tidak ada |  |  |</w:t>
+        <w:t>Jawaban Client: ____________________</w:t>
       </w:r>
     </w:p>
     <w:p>
       <w:r>
-        <w:t>| Data yang mau dipindahkan di awal | Data master saja / Master + saldo awal / Full histori |  |  |</w:t>
+        <w:t>Catatan: ____________________</w:t>
+      </w:r>
+    </w:p>
+    <w:p/>
+    <w:p>
+      <w:r>
+        <w:t>2) Inventory + Gudang</w:t>
       </w:r>
     </w:p>
     <w:p>
       <w:r>
-        <w:t>| Integrasi yang dibutuhkan | Tidak ada / Payment / Marketplace / Delivery app / Lainnya |  |  |</w:t>
+        <w:t>Pilihan: MVP / Phase 2 / Phase 3</w:t>
       </w:r>
     </w:p>
     <w:p>
       <w:r>
-        <w:t>| Kebutuhan sinkron data ke sistem lain | Tidak perlu / Perlu lihat data / Perlu kirim dan terima data |  |  |</w:t>
+        <w:t>Jawaban Client: ____________________</w:t>
       </w:r>
     </w:p>
     <w:p>
       <w:r>
-        <w:t>| Siapa pemilik data final | Tetap di sistem lama / Pindah ke sistem baru / Campuran sementara |  |  |</w:t>
+        <w:t>Catatan: ____________________</w:t>
+      </w:r>
+    </w:p>
+    <w:p/>
+    <w:p>
+      <w:r>
+        <w:t>3) Dapur + Resep + Waste</w:t>
+      </w:r>
+    </w:p>
+    <w:p>
+      <w:r>
+        <w:t>Pilihan: MVP / Phase 2 / Phase 3</w:t>
+      </w:r>
+    </w:p>
+    <w:p>
+      <w:r>
+        <w:t>Jawaban Client: ____________________</w:t>
+      </w:r>
+    </w:p>
+    <w:p>
+      <w:r>
+        <w:t>Catatan: ____________________</w:t>
+      </w:r>
+    </w:p>
+    <w:p/>
+    <w:p>
+      <w:r>
+        <w:t>4) Purchase + Supplier</w:t>
+      </w:r>
+    </w:p>
+    <w:p>
+      <w:r>
+        <w:t>Pilihan: MVP / Phase 2 / Phase 3</w:t>
+      </w:r>
+    </w:p>
+    <w:p>
+      <w:r>
+        <w:t>Jawaban Client: ____________________</w:t>
+      </w:r>
+    </w:p>
+    <w:p>
+      <w:r>
+        <w:t>Catatan: ____________________</w:t>
+      </w:r>
+    </w:p>
+    <w:p/>
+    <w:p>
+      <w:r>
+        <w:t>5) Accounting + Laporan</w:t>
+      </w:r>
+    </w:p>
+    <w:p>
+      <w:r>
+        <w:t>Pilihan: MVP / Phase 2 / Phase 3</w:t>
+      </w:r>
+    </w:p>
+    <w:p>
+      <w:r>
+        <w:t>Jawaban Client: ____________________</w:t>
+      </w:r>
+    </w:p>
+    <w:p>
+      <w:r>
+        <w:t>Catatan: ____________________</w:t>
+      </w:r>
+    </w:p>
+    <w:p/>
+    <w:p>
+      <w:r>
+        <w:t>6) HR/Payroll</w:t>
+      </w:r>
+    </w:p>
+    <w:p>
+      <w:r>
+        <w:t>Pilihan: MVP / Phase 2 / Phase 3</w:t>
+      </w:r>
+    </w:p>
+    <w:p>
+      <w:r>
+        <w:t>Jawaban Client: ____________________</w:t>
+      </w:r>
+    </w:p>
+    <w:p>
+      <w:r>
+        <w:t>Catatan: ____________________</w:t>
+      </w:r>
+    </w:p>
+    <w:p/>
+    <w:p>
+      <w:r>
+        <w:t>________________________________________________________________________________</w:t>
       </w:r>
     </w:p>
     <w:p/>
@@ -492,156 +1177,40 @@
         <w:pStyle w:val="Heading2"/>
       </w:pPr>
       <w:r>
-        <w:t>J. Prioritas Implementasi</w:t>
+        <w:t>J. Catatan Tambahan Client</w:t>
       </w:r>
     </w:p>
     <w:p/>
     <w:p>
       <w:r>
-        <w:t>| Area | Prioritas | Catatan Client |</w:t>
+        <w:t>1) Kendala operasional paling sering saat ini:</w:t>
       </w:r>
     </w:p>
     <w:p>
       <w:r>
-        <w:t>|---|---|---|</w:t>
+        <w:t>Jawaban Client: ________________________________________________</w:t>
+      </w:r>
+    </w:p>
+    <w:p/>
+    <w:p>
+      <w:r>
+        <w:t>2) Risiko terbesar saat implementasi menurut client:</w:t>
       </w:r>
     </w:p>
     <w:p>
       <w:r>
-        <w:t>| POS + Pembayaran | MVP / Phase 2 |  |</w:t>
+        <w:t>Jawaban Client: ________________________________________________</w:t>
+      </w:r>
+    </w:p>
+    <w:p/>
+    <w:p>
+      <w:r>
+        <w:t>3) Hal yang wajib sudah jalan saat hari pertama go-live:</w:t>
       </w:r>
     </w:p>
     <w:p>
       <w:r>
-        <w:t>| Inventory + Gudang | MVP / Phase 2 |  |</w:t>
-      </w:r>
-    </w:p>
-    <w:p>
-      <w:r>
-        <w:t>| Dapur + BOM + Waste | MVP / Phase 2 |  |</w:t>
-      </w:r>
-    </w:p>
-    <w:p>
-      <w:r>
-        <w:t>| Purchase + Supplier | MVP / Phase 2 |  |</w:t>
-      </w:r>
-    </w:p>
-    <w:p>
-      <w:r>
-        <w:t>| Accounting + Laporan | MVP / Phase 2 |  |</w:t>
-      </w:r>
-    </w:p>
-    <w:p>
-      <w:r>
-        <w:t>| HR/Payroll | MVP / Phase 2 |  |</w:t>
-      </w:r>
-    </w:p>
-    <w:p/>
-    <w:p>
-      <w:pPr>
-        <w:pStyle w:val="Heading2"/>
-      </w:pPr>
-      <w:r>
-        <w:t>K. Catatan Khusus dan Risiko</w:t>
-      </w:r>
-    </w:p>
-    <w:p/>
-    <w:p>
-      <w:pPr>
-        <w:pStyle w:val="ListBullet"/>
-      </w:pPr>
-      <w:r>
-        <w:t>Constraint operasional (jam sibuk, internet, perangkat):</w:t>
-      </w:r>
-    </w:p>
-    <w:p>
-      <w:pPr>
-        <w:pStyle w:val="ListBullet"/>
-      </w:pPr>
-      <w:r>
-        <w:t>Policy internal (approval, limit diskon, tutup kasir):</w:t>
-      </w:r>
-    </w:p>
-    <w:p>
-      <w:pPr>
-        <w:pStyle w:val="ListBullet"/>
-      </w:pPr>
-      <w:r>
-        <w:t>Risiko terbesar menurut client:</w:t>
-      </w:r>
-    </w:p>
-    <w:p>
-      <w:pPr>
-        <w:pStyle w:val="ListBullet"/>
-      </w:pPr>
-      <w:r>
-        <w:t>Keputusan yang harus final sebelum development:</w:t>
-      </w:r>
-    </w:p>
-    <w:p/>
-    <w:p>
-      <w:pPr>
-        <w:pStyle w:val="Heading2"/>
-      </w:pPr>
-      <w:r>
-        <w:t>L. Ringkasan Keputusan (Diisi Tim Implementasi)</w:t>
-      </w:r>
-    </w:p>
-    <w:p/>
-    <w:p>
-      <w:pPr>
-        <w:pStyle w:val="ListBullet"/>
-      </w:pPr>
-      <w:r>
-        <w:t>Behavior POS final:</w:t>
-      </w:r>
-    </w:p>
-    <w:p>
-      <w:pPr>
-        <w:pStyle w:val="ListBullet"/>
-      </w:pPr>
-      <w:r>
-        <w:t>Behavior persediaan final:</w:t>
-      </w:r>
-    </w:p>
-    <w:p>
-      <w:pPr>
-        <w:pStyle w:val="ListBullet"/>
-      </w:pPr>
-      <w:r>
-        <w:t>Behavior dapur/BOM final:</w:t>
-      </w:r>
-    </w:p>
-    <w:p>
-      <w:pPr>
-        <w:pStyle w:val="ListBullet"/>
-      </w:pPr>
-      <w:r>
-        <w:t>Alur pembelian final:</w:t>
-      </w:r>
-    </w:p>
-    <w:p>
-      <w:pPr>
-        <w:pStyle w:val="ListBullet"/>
-      </w:pPr>
-      <w:r>
-        <w:t>Alur posting jurnal final:</w:t>
-      </w:r>
-    </w:p>
-    <w:p>
-      <w:pPr>
-        <w:pStyle w:val="ListBullet"/>
-      </w:pPr>
-      <w:r>
-        <w:t>Scope MVP final:</w:t>
-      </w:r>
-    </w:p>
-    <w:p>
-      <w:pPr>
-        <w:pStyle w:val="ListBullet"/>
-      </w:pPr>
-      <w:r>
-        <w:t>Scope Phase 2 final:</w:t>
+        <w:t>Jawaban Client: ________________________________________________</w:t>
       </w:r>
     </w:p>
     <w:sectPr>

</xml_diff>